<commit_message>
fix(report): replace ungrounded seed c2-035, drop claims the numbers do not support
</commit_message>
<xml_diff>
--- a/reports/BaoCao_DoAn_MayHoc.docx
+++ b/reports/BaoCao_DoAn_MayHoc.docx
@@ -193,7 +193,7 @@
           <w:b w:val="0"/>
           <w:i w:val="0"/>
         </w:rPr>
-        <w:t>Bốn mô hình được so sánh: Multinomial Naive Bayes, Logistic Regression, LinearSVC và Random Forest, tinh chỉnh bằng GridSearchCV với StratifiedGroupKFold. Mô hình tốt nhất theo Macro-F1 trên tập validation là Linear SVM (LinearSVC) (val Macro-F1 = 86.93%, test Macro-F1 = 90.07%, câu hỏi thật Macro-F1 = 60.54%).</w:t>
+        <w:t>Bốn mô hình được so sánh: Multinomial Naive Bayes, Logistic Regression, LinearSVC và Random Forest, tinh chỉnh bằng GridSearchCV với StratifiedGroupKFold. Mô hình có Macro-F1 cao nhất trên tập validation là Linear SVM (LinearSVC) (val Macro-F1 = 86.93%, test Macro-F1 = 90.51%, câu hỏi thật Macro-F1 = 60.54%, tính trên các lớp có mặt trong tập thật).</w:t>
       </w:r>
     </w:p>
     <w:p>
@@ -2028,7 +2028,19 @@
           <w:b w:val="0"/>
           <w:i w:val="0"/>
         </w:rPr>
-        <w:t>Tập test thật gồm 29 câu hỏi thực tế từ chinhsachonline.chinhphu.vn, nhãn lấy theo Điều của Luật ATVSLĐ mà cơ quan nhà nước viện dẫn trong câu trả lời. Tập này không được dùng khi huấn luyện hay chọn mô hình. Phân bố lớp của tập này không đều (phản ánh nhu cầu hỏi thực tế).</w:t>
+        <w:t>Mỗi tập gần cân bằng: mỗi lớp có 140–145 mẫu ở train, 25–30 mẫu ở val, 25–30 mẫu ở test. Chênh lệch nhỏ do phải giữ nguyên nhóm câu gốc (5 mẫu) khi chia.</w:t>
+      </w:r>
+    </w:p>
+    <w:p>
+      <w:pPr>
+        <w:spacing w:after="120" w:line="312" w:lineRule="auto"/>
+      </w:pPr>
+      <w:r>
+        <w:rPr>
+          <w:b w:val="0"/>
+          <w:i w:val="0"/>
+        </w:rPr>
+        <w:t>Tập test thật gồm 29 câu hỏi thực tế từ chinhsachonline.chinhphu.vn, nhãn lấy theo Điều của Luật ATVSLĐ mà cơ quan nhà nước viện dẫn trong câu trả lời. Tập này không được dùng khi huấn luyện hay chọn mô hình. Phân bố lớp lệch (số câu mỗi lớp: 1, 10, 0, 2, 1, 9, 1, 5). Không có câu nào thuộc PHUONG_TIEN_BAO_HO. Đây là các câu còn lại sau khi lọc, không phải mẫu đại diện cho tần suất nhu cầu hỏi thực tế.</w:t>
       </w:r>
     </w:p>
     <w:p>
@@ -2104,7 +2116,7 @@
           <w:b w:val="0"/>
           <w:i w:val="0"/>
         </w:rPr>
-        <w:t>Độ dài câu hỏi trung bình 20.5 âm tiết (min 5.0, max 42.0). Văn phong rút gọn ngắn nhất (7.2), văn phong khiếu nại dài nhất (25.8). Câu hỏi thật có độ dài trung bình 127.3 âm tiết, dài hơn nhiều so với dữ liệu synthetic, thường kèm bối cảnh cụ thể.</w:t>
+        <w:t>Độ dài câu hỏi trung bình 20.5 âm tiết (min 5.0, max 42.0). Văn phong rút gọn ngắn nhất (7.2), văn phong nhân sự/HSE dài nhất (29.2). Câu hỏi thật có độ dài trung bình 127.3 âm tiết, dài hơn nhiều so với dữ liệu synthetic, thường kèm bối cảnh cụ thể.</w:t>
       </w:r>
     </w:p>
     <w:p>
@@ -2508,6 +2520,14 @@
         <w:pStyle w:val="ListBullet"/>
       </w:pPr>
       <w:r>
+        <w:t>Giá trị thiếu: kiểm tra bằng pandas isna() trên data/processed/ohs_questions.csv, có 0 ô thiếu nên không cần loại hay điền mẫu. Dữ liệu dạng văn bản nên không có bước chuẩn hóa số hay mã hóa biến phân loại; nhãn đã là số nguyên 0–7.</w:t>
+      </w:r>
+    </w:p>
+    <w:p>
+      <w:pPr>
+        <w:pStyle w:val="ListBullet"/>
+      </w:pPr>
+      <w:r>
         <w:t>Chuẩn hóa Unicode NFC, chuyển chữ thường, loại URL, email, thẻ HTML, ký tự đặc biệt.</w:t>
       </w:r>
     </w:p>
@@ -2887,7 +2907,7 @@
               <w:rPr>
                 <w:sz w:val="22"/>
               </w:rPr>
-              <w:t>77.97%</w:t>
+              <w:t>78.00%</w:t>
             </w:r>
           </w:p>
         </w:tc>
@@ -2900,7 +2920,7 @@
               <w:rPr>
                 <w:sz w:val="22"/>
               </w:rPr>
-              <w:t>1.8</w:t>
+              <w:t>2.0</w:t>
             </w:r>
           </w:p>
         </w:tc>
@@ -2941,7 +2961,7 @@
               <w:rPr>
                 <w:sz w:val="22"/>
               </w:rPr>
-              <w:t>83.31%</w:t>
+              <w:t>83.58%</w:t>
             </w:r>
           </w:p>
         </w:tc>
@@ -2995,7 +3015,7 @@
               <w:rPr>
                 <w:sz w:val="22"/>
               </w:rPr>
-              <w:t>82.58%</w:t>
+              <w:t>82.82%</w:t>
             </w:r>
           </w:p>
         </w:tc>
@@ -3008,7 +3028,7 @@
               <w:rPr>
                 <w:sz w:val="22"/>
               </w:rPr>
-              <w:t>0.4</w:t>
+              <w:t>0.5</w:t>
             </w:r>
           </w:p>
         </w:tc>
@@ -3049,7 +3069,7 @@
               <w:rPr>
                 <w:sz w:val="22"/>
               </w:rPr>
-              <w:t>81.22%</w:t>
+              <w:t>81.70%</w:t>
             </w:r>
           </w:p>
         </w:tc>
@@ -3062,7 +3082,7 @@
               <w:rPr>
                 <w:sz w:val="22"/>
               </w:rPr>
-              <w:t>3.5</w:t>
+              <w:t>3.2</w:t>
             </w:r>
           </w:p>
         </w:tc>
@@ -3315,7 +3335,7 @@
               <w:rPr>
                 <w:sz w:val="22"/>
               </w:rPr>
-              <w:t>86.52%</w:t>
+              <w:t>86.09%</w:t>
             </w:r>
           </w:p>
         </w:tc>
@@ -3328,7 +3348,7 @@
               <w:rPr>
                 <w:sz w:val="22"/>
               </w:rPr>
-              <w:t>86.35%</w:t>
+              <w:t>85.95%</w:t>
             </w:r>
           </w:p>
         </w:tc>
@@ -3354,7 +3374,7 @@
               <w:rPr>
                 <w:sz w:val="22"/>
               </w:rPr>
-              <w:t>53.25%</w:t>
+              <w:t>53.03%</w:t>
             </w:r>
           </w:p>
         </w:tc>
@@ -3553,7 +3573,7 @@
               <w:rPr>
                 <w:sz w:val="22"/>
               </w:rPr>
-              <w:t>90.43%</w:t>
+              <w:t>90.87%</w:t>
             </w:r>
           </w:p>
         </w:tc>
@@ -3566,7 +3586,7 @@
               <w:rPr>
                 <w:sz w:val="22"/>
               </w:rPr>
-              <w:t>90.07%</w:t>
+              <w:t>90.51%</w:t>
             </w:r>
           </w:p>
         </w:tc>
@@ -3620,7 +3640,7 @@
               <w:rPr>
                 <w:sz w:val="22"/>
               </w:rPr>
-              <w:t>83.04%</w:t>
+              <w:t>80.43%</w:t>
             </w:r>
           </w:p>
         </w:tc>
@@ -3633,7 +3653,7 @@
               <w:rPr>
                 <w:sz w:val="22"/>
               </w:rPr>
-              <w:t>83.59%</w:t>
+              <w:t>81.43%</w:t>
             </w:r>
           </w:p>
         </w:tc>
@@ -3646,7 +3666,7 @@
               <w:rPr>
                 <w:sz w:val="22"/>
               </w:rPr>
-              <w:t>83.17%</w:t>
+              <w:t>80.50%</w:t>
             </w:r>
           </w:p>
         </w:tc>
@@ -3659,7 +3679,7 @@
               <w:rPr>
                 <w:sz w:val="22"/>
               </w:rPr>
-              <w:t>82.82%</w:t>
+              <w:t>80.25%</w:t>
             </w:r>
           </w:p>
         </w:tc>
@@ -3672,7 +3692,7 @@
               <w:rPr>
                 <w:sz w:val="22"/>
               </w:rPr>
-              <w:t>86.52%</w:t>
+              <w:t>86.09%</w:t>
             </w:r>
           </w:p>
         </w:tc>
@@ -3685,7 +3705,7 @@
               <w:rPr>
                 <w:sz w:val="22"/>
               </w:rPr>
-              <w:t>86.59%</w:t>
+              <w:t>86.19%</w:t>
             </w:r>
           </w:p>
         </w:tc>
@@ -3698,7 +3718,7 @@
               <w:rPr>
                 <w:sz w:val="22"/>
               </w:rPr>
-              <w:t>62.07%</w:t>
+              <w:t>65.52%</w:t>
             </w:r>
           </w:p>
         </w:tc>
@@ -3711,7 +3731,7 @@
               <w:rPr>
                 <w:sz w:val="22"/>
               </w:rPr>
-              <w:t>43.71%</w:t>
+              <w:t>46.98%</w:t>
             </w:r>
           </w:p>
         </w:tc>
@@ -3779,7 +3799,31 @@
           <w:b w:val="0"/>
           <w:i w:val="0"/>
         </w:rPr>
-        <w:t>Mô hình tốt nhất là Linear SVM (LinearSVC), hơn mô hình đứng thứ hai (Logistic Regression) 0.79 điểm phần trăm Macro-F1 trên validation. Thứ hạng theo val Macro-F1: Linear SVM (LinearSVC) &gt; Logistic Regression &gt; Random Forest &gt; Multinomial Naive Bayes.</w:t>
+        <w:t>Mô hình được chọn là Linear SVM (LinearSVC) (val Macro-F1 cao nhất), hơn mô hình đứng thứ hai (Logistic Regression) 0.79 điểm phần trăm trên validation. Thứ hạng theo val Macro-F1: Linear SVM (LinearSVC) &gt; Logistic Regression &gt; Multinomial Naive Bayes &gt; Random Forest.</w:t>
+      </w:r>
+    </w:p>
+    <w:p>
+      <w:pPr>
+        <w:spacing w:after="120" w:line="312" w:lineRule="auto"/>
+      </w:pPr>
+      <w:r>
+        <w:rPr>
+          <w:b w:val="0"/>
+          <w:i w:val="0"/>
+        </w:rPr>
+        <w:t>Lưu ý: theo CV Macro-F1 trên train, thứ tự đảo lại (Logistic Regression 83.58% so với Linear SVM (LinearSVC) 82.82%), và độ lệch chuẩn giữa các fold khoảng 7.0 điểm. Validation chỉ là một lần chia, nên chênh lệch giữa hai mô hình tuyến tính chưa đủ để kết luận mô hình nào vượt trội; cần lặp nhiều lần chia hoặc kiểm định cặp để khẳng định.</w:t>
+      </w:r>
+    </w:p>
+    <w:p>
+      <w:pPr>
+        <w:spacing w:after="120" w:line="312" w:lineRule="auto"/>
+      </w:pPr>
+      <w:r>
+        <w:rPr>
+          <w:b w:val="0"/>
+          <w:i w:val="0"/>
+        </w:rPr>
+        <w:t>Macro-F1 trên câu hỏi thật chỉ tính trên các lớp có mặt trong 29 câu (vắng PHUONG_TIEN_BAO_HO), còn Macro-F1 trên test synthetic tính trên đủ 8 lớp. Hai con số không cùng tập lớp nên chỉ so sánh tương đối.</w:t>
       </w:r>
     </w:p>
     <w:p>
@@ -4239,6 +4283,19 @@
               <w:rPr>
                 <w:sz w:val="22"/>
               </w:rPr>
+              <w:t>100.00%</w:t>
+            </w:r>
+          </w:p>
+        </w:tc>
+        <w:tc>
+          <w:tcPr>
+            <w:tcW w:type="dxa" w:w="1881"/>
+          </w:tcPr>
+          <w:p>
+            <w:r>
+              <w:rPr>
+                <w:sz w:val="22"/>
+              </w:rPr>
               <w:t>96.67%</w:t>
             </w:r>
           </w:p>
@@ -4252,20 +4309,7 @@
               <w:rPr>
                 <w:sz w:val="22"/>
               </w:rPr>
-              <w:t>96.67%</w:t>
-            </w:r>
-          </w:p>
-        </w:tc>
-        <w:tc>
-          <w:tcPr>
-            <w:tcW w:type="dxa" w:w="1881"/>
-          </w:tcPr>
-          <w:p>
-            <w:r>
-              <w:rPr>
-                <w:sz w:val="22"/>
-              </w:rPr>
-              <w:t>96.67%</w:t>
+              <w:t>98.31%</w:t>
             </w:r>
           </w:p>
         </w:tc>
@@ -4386,7 +4430,7 @@
               <w:rPr>
                 <w:sz w:val="22"/>
               </w:rPr>
-              <w:t>90.00%</w:t>
+              <w:t>93.33%</w:t>
             </w:r>
           </w:p>
         </w:tc>
@@ -4399,7 +4443,7 @@
               <w:rPr>
                 <w:sz w:val="22"/>
               </w:rPr>
-              <w:t>94.74%</w:t>
+              <w:t>96.55%</w:t>
             </w:r>
           </w:p>
         </w:tc>
@@ -4428,7 +4472,19 @@
           <w:b w:val="0"/>
           <w:i w:val="0"/>
         </w:rPr>
-        <w:t>Hai lớp có F1 thấp nhất trên test là QUY_DINH_CHUNG (71.70%) và BIEN_PHAP_PHONG_NGUA (77.19%). Macro-F1 được dùng làm chỉ số chính vì tính trung bình đều giữa các lớp, không để lớp lớn lấn át (quan trọng với tập test thật có phân bố lệch).</w:t>
+        <w:t>Hai lớp có F1 thấp nhất trên test là QUY_DINH_CHUNG (71.70%) và BIEN_PHAP_PHONG_NGUA (77.19%).</w:t>
+      </w:r>
+    </w:p>
+    <w:p>
+      <w:pPr>
+        <w:spacing w:after="120" w:line="312" w:lineRule="auto"/>
+      </w:pPr>
+      <w:r>
+        <w:rPr>
+          <w:b w:val="0"/>
+          <w:i w:val="0"/>
+        </w:rPr>
+        <w:t>Phân tích precision và recall: QUY_DINH_CHUNG: precision 67.86%, recall 76.00%, mô hình gán nhầm nhiều câu của lớp khác vào lớp này (dương tính giả); BIEN_PHAP_PHONG_NGUA: precision 81.48%, recall 73.33%, mô hình bỏ sót nhiều câu của lớp này sang lớp khác. Macro-F1 được dùng làm chỉ số chính vì tính trung bình đều giữa các lớp, không để lớp lớn lấn át (quan trọng với tập test thật có phân bố lệch).</w:t>
       </w:r>
     </w:p>
     <w:p>
@@ -4492,7 +4548,19 @@
           <w:b w:val="0"/>
           <w:i w:val="0"/>
         </w:rPr>
-        <w:t>Các cặp nhầm lẫn nhiều nhất (cộng dồn 4 mô hình, test synthetic): BIEN_PHAP_PHONG_NGUA -&gt; QUY_DINH_CHUNG (30 lần); QUY_DINH_CHUNG -&gt; BIEN_PHAP_PHONG_NGUA (13 lần); KHAI_BAO_DIEU_TRA -&gt; QUY_DINH_CHUNG (12 lần); BIEN_PHAP_PHONG_NGUA -&gt; KHAI_BAO_DIEU_TRA (6 lần); BIEN_PHAP_PHONG_NGUA -&gt; HUAN_LUYEN_ATLD (5 lần).</w:t>
+        <w:t>Các cặp Linear SVM (LinearSVC) nhầm nhiều nhất trên test synthetic (lớp thật -&gt; lớp dự đoán): BIEN_PHAP_PHONG_NGUA -&gt; QUY_DINH_CHUNG (6 câu); QUY_DINH_CHUNG -&gt; BIEN_PHAP_PHONG_NGUA (5 câu); BIEN_PHAP_PHONG_NGUA -&gt; KHAI_BAO_DIEU_TRA (2 câu); BAO_HIEM_TNLD -&gt; PHUONG_TIEN_BAO_HO (2 câu).</w:t>
+      </w:r>
+    </w:p>
+    <w:p>
+      <w:pPr>
+        <w:spacing w:after="120" w:line="312" w:lineRule="auto"/>
+      </w:pPr>
+      <w:r>
+        <w:rPr>
+          <w:b w:val="0"/>
+          <w:i w:val="0"/>
+        </w:rPr>
+        <w:t>Để so sánh, cộng dồn cả 4 mô hình trên test synthetic: BIEN_PHAP_PHONG_NGUA -&gt; QUY_DINH_CHUNG (30 lần); QUY_DINH_CHUNG -&gt; BIEN_PHAP_PHONG_NGUA (13 lần); KHAI_BAO_DIEU_TRA -&gt; QUY_DINH_CHUNG (11 lần); BIEN_PHAP_PHONG_NGUA -&gt; KHAI_BAO_DIEU_TRA (6 lần); CHE_DO_BOI_THUONG -&gt; SUC_KHOE_BOI_DUONG (5 lần).</w:t>
       </w:r>
     </w:p>
     <w:p>
@@ -4586,7 +4654,7 @@
                 <w:b/>
                 <w:sz w:val="22"/>
               </w:rPr>
-              <w:t>Chênh lệch</w:t>
+              <w:t>Chênh lệch (điểm %)</w:t>
             </w:r>
           </w:p>
         </w:tc>
@@ -4640,7 +4708,7 @@
               <w:rPr>
                 <w:sz w:val="22"/>
               </w:rPr>
-              <w:t>17.12%</w:t>
+              <w:t>17.11</w:t>
             </w:r>
           </w:p>
         </w:tc>
@@ -4668,7 +4736,7 @@
               <w:rPr>
                 <w:sz w:val="22"/>
               </w:rPr>
-              <w:t>99.12%</w:t>
+              <w:t>99.03%</w:t>
             </w:r>
           </w:p>
         </w:tc>
@@ -4694,7 +4762,7 @@
               <w:rPr>
                 <w:sz w:val="22"/>
               </w:rPr>
-              <w:t>12.98%</w:t>
+              <w:t>12.89</w:t>
             </w:r>
           </w:p>
         </w:tc>
@@ -4748,7 +4816,7 @@
               <w:rPr>
                 <w:sz w:val="22"/>
               </w:rPr>
-              <w:t>12.98%</w:t>
+              <w:t>12.99</w:t>
             </w:r>
           </w:p>
         </w:tc>
@@ -4776,7 +4844,7 @@
               <w:rPr>
                 <w:sz w:val="22"/>
               </w:rPr>
-              <w:t>99.91%</w:t>
+              <w:t>100.00%</w:t>
             </w:r>
           </w:p>
         </w:tc>
@@ -4789,7 +4857,7 @@
               <w:rPr>
                 <w:sz w:val="22"/>
               </w:rPr>
-              <w:t>82.82%</w:t>
+              <w:t>80.25%</w:t>
             </w:r>
           </w:p>
         </w:tc>
@@ -4802,7 +4870,7 @@
               <w:rPr>
                 <w:sz w:val="22"/>
               </w:rPr>
-              <w:t>17.09%</w:t>
+              <w:t>19.75</w:t>
             </w:r>
           </w:p>
         </w:tc>
@@ -4818,7 +4886,7 @@
           <w:b w:val="0"/>
           <w:i w:val="0"/>
         </w:rPr>
-        <w:t xml:space="preserve">Các mô hình có chênh lệch train–val trên 10 điểm: Multinomial Naive Bayes, Logistic Regression, Linear SVM (LinearSVC), Random Forest, cho thấy dấu hiệu overfitting (mô hình nhớ từ vựng của tập train). </w:t>
+        <w:t>Các mô hình có chênh lệch train–val trên 10 điểm: Multinomial Naive Bayes, Logistic Regression, Linear SVM (LinearSVC), Random Forest, cho thấy dấu hiệu overfitting (Train F1 gần 100%). Số liệu chỉ cho thấy khoảng cách, chưa đo trực tiếp nguyên nhân.</w:t>
       </w:r>
     </w:p>
     <w:p>
@@ -4830,7 +4898,7 @@
           <w:b w:val="0"/>
           <w:i w:val="0"/>
         </w:rPr>
-        <w:t>Khoảng cách quan trọng nhất là giữa test synthetic và câu hỏi thật: Macro-F1 của Linear SVM (LinearSVC) giảm 29.54 điểm. Giả thuyết: domain shift (câu hỏi thật dài hơn, nhiều bối cảnh, dùng từ ngữ của Nghị định/Thông tư, phân bố lớp khác). Lưu ý tập thật chỉ có 29 câu nên số liệu dao động lớn.</w:t>
+        <w:t>Khoảng cách quan trọng nhất là giữa test synthetic và câu hỏi thật: Macro-F1 của Linear SVM (LinearSVC) giảm 29.97 điểm. Giả thuyết: domain shift (câu hỏi thật dài hơn, nhiều bối cảnh, dùng từ ngữ của Nghị định/Thông tư, phân bố lớp khác). Lưu ý tập thật chỉ có 29 câu nên số liệu dao động lớn.</w:t>
       </w:r>
     </w:p>
     <w:p>
@@ -4918,7 +4986,7 @@
           <w:b w:val="0"/>
           <w:i w:val="0"/>
         </w:rPr>
-        <w:t xml:space="preserve">Kết quả phù hợp với nhận định thường gặp: với TF-IDF (thưa, hàng nghìn chiều, ít mẫu), mô hình tuyến tính (LinearSVC, Logistic Regression) có lợi thế vì mỗi từ khóa đóng góp tuyến tính vào quyết định và điều chuẩn giúp tổng quát hóa. </w:t>
+        <w:t xml:space="preserve">Hai mô hình tuyến tính (LinearSVC, Logistic Regression) dẫn đầu cả trên val và CV, phù hợp với nhận định thường gặp rằng mô hình tuyến tính có điều chuẩn làm việc tốt trên TF-IDF (thưa, hàng nghìn chiều, ít mẫu). Đây là giải thích dựa trên lý thuyết, đề tài chưa làm thí nghiệm riêng để kiểm chứng nguyên nhân. </w:t>
       </w:r>
     </w:p>
     <w:p>
@@ -4930,7 +4998,7 @@
           <w:b w:val="0"/>
           <w:i w:val="0"/>
         </w:rPr>
-        <w:t>Naive Bayes giả định các từ độc lập có điều kiện, không mô hình hóa tương quan giữa các bigram. Random Forest chia nhánh trên từng đặc trưng thưa, khó tận dụng hàng nghìn từ hiếm và dễ khớp quá mức tập train (chênh lệch train–val của RF: 17.09%).</w:t>
+        <w:t>Giả thuyết cho hai mô hình còn lại: Naive Bayes giả định các từ độc lập có điều kiện nên không mô hình hóa tương quan giữa các đặc trưng; Random Forest chia nhánh trên từng đặc trưng thưa nên khó tận dụng nhiều từ hiếm. Quan sát được: chênh lệch train–val của RF là 19.75 điểm, của NB là 17.11 điểm.</w:t>
       </w:r>
     </w:p>
     <w:p>
@@ -4942,7 +5010,7 @@
           <w:b w:val="0"/>
           <w:i w:val="0"/>
         </w:rPr>
-        <w:t>Kết quả thực nghiệm: Linear SVM (LinearSVC) 86.93%, Logistic Regression 86.14%, Random Forest 82.82%, Multinomial Naive Bayes 81.21% (val Macro-F1).</w:t>
+        <w:t>Kết quả thực nghiệm: Linear SVM (LinearSVC) 86.93%, Logistic Regression 86.14%, Multinomial Naive Bayes 81.21%, Random Forest 80.25% (val Macro-F1).</w:t>
       </w:r>
     </w:p>
     <w:p>
@@ -5094,7 +5162,7 @@
               <w:rPr>
                 <w:sz w:val="22"/>
               </w:rPr>
-              <w:t>82.58% ± 6.50</w:t>
+              <w:t>82.82% ± 6.62</w:t>
             </w:r>
           </w:p>
         </w:tc>
@@ -5120,7 +5188,7 @@
               <w:rPr>
                 <w:sz w:val="22"/>
               </w:rPr>
-              <w:t>90.07%</w:t>
+              <w:t>90.51%</w:t>
             </w:r>
           </w:p>
         </w:tc>
@@ -5146,7 +5214,7 @@
               <w:rPr>
                 <w:sz w:val="22"/>
               </w:rPr>
-              <w:t>2520</w:t>
+              <w:t>2524</w:t>
             </w:r>
           </w:p>
         </w:tc>
@@ -5174,7 +5242,7 @@
               <w:rPr>
                 <w:sz w:val="22"/>
               </w:rPr>
-              <w:t>82.13% ± 6.11</w:t>
+              <w:t>82.15% ± 5.97</w:t>
             </w:r>
           </w:p>
         </w:tc>
@@ -5187,7 +5255,7 @@
               <w:rPr>
                 <w:sz w:val="22"/>
               </w:rPr>
-              <w:t>86.30%</w:t>
+              <w:t>86.70%</w:t>
             </w:r>
           </w:p>
         </w:tc>
@@ -5226,7 +5294,7 @@
               <w:rPr>
                 <w:sz w:val="22"/>
               </w:rPr>
-              <w:t>3358</w:t>
+              <w:t>3363</w:t>
             </w:r>
           </w:p>
         </w:tc>
@@ -5254,7 +5322,7 @@
               <w:rPr>
                 <w:sz w:val="22"/>
               </w:rPr>
-              <w:t>82.79% ± 5.52</w:t>
+              <w:t>83.18% ± 5.30</w:t>
             </w:r>
           </w:p>
         </w:tc>
@@ -5267,7 +5335,7 @@
               <w:rPr>
                 <w:sz w:val="22"/>
               </w:rPr>
-              <w:t>88.22%</w:t>
+              <w:t>87.80%</w:t>
             </w:r>
           </w:p>
         </w:tc>
@@ -5306,7 +5374,7 @@
               <w:rPr>
                 <w:sz w:val="22"/>
               </w:rPr>
-              <w:t>817</w:t>
+              <w:t>819</w:t>
             </w:r>
           </w:p>
         </w:tc>
@@ -5334,7 +5402,7 @@
               <w:rPr>
                 <w:sz w:val="22"/>
               </w:rPr>
-              <w:t>81.53% ± 7.21</w:t>
+              <w:t>81.39% ± 6.99</w:t>
             </w:r>
           </w:p>
         </w:tc>
@@ -5360,7 +5428,7 @@
               <w:rPr>
                 <w:sz w:val="22"/>
               </w:rPr>
-              <w:t>88.71%</w:t>
+              <w:t>89.23%</w:t>
             </w:r>
           </w:p>
         </w:tc>
@@ -5386,7 +5454,7 @@
               <w:rPr>
                 <w:sz w:val="22"/>
               </w:rPr>
-              <w:t>2957</w:t>
+              <w:t>2961</w:t>
             </w:r>
           </w:p>
         </w:tc>
@@ -5414,7 +5482,7 @@
               <w:rPr>
                 <w:sz w:val="22"/>
               </w:rPr>
-              <w:t>81.33% ± 5.75</w:t>
+              <w:t>81.26% ± 5.77</w:t>
             </w:r>
           </w:p>
         </w:tc>
@@ -5440,7 +5508,7 @@
               <w:rPr>
                 <w:sz w:val="22"/>
               </w:rPr>
-              <w:t>91.81%</w:t>
+              <w:t>91.39%</w:t>
             </w:r>
           </w:p>
         </w:tc>
@@ -5466,7 +5534,7 @@
               <w:rPr>
                 <w:sz w:val="22"/>
               </w:rPr>
-              <w:t>802</w:t>
+              <w:t>804</w:t>
             </w:r>
           </w:p>
         </w:tc>
@@ -5530,7 +5598,7 @@
         <w:pStyle w:val="ListBullet"/>
       </w:pPr>
       <w:r>
-        <w:t>Tách từ tiếng Việt (#4 so với #2): chênh -0.60 điểm CV Macro-F1.</w:t>
+        <w:t>Tách từ tiếng Việt (#4 so với #2): CV -0.76 điểm (std ≈ 7.0, nhỏ hơn độ lệch chuẩn giữa các fold, chưa đủ bằng chứng); test -3.70; câu thật +1.68 điểm.</w:t>
       </w:r>
     </w:p>
     <w:p>
@@ -5538,7 +5606,7 @@
         <w:pStyle w:val="ListBullet"/>
       </w:pPr>
       <w:r>
-        <w:t>Bigram (#1 so với #3): chênh -0.21 điểm.</w:t>
+        <w:t>Bigram (#1 so với #3): CV -0.36 điểm (std ≈ 6.6, nhỏ hơn độ lệch chuẩn giữa các fold, chưa đủ bằng chứng); test +2.45; câu thật +1.79 điểm.</w:t>
       </w:r>
     </w:p>
     <w:p>
@@ -5546,7 +5614,7 @@
         <w:pStyle w:val="ListBullet"/>
       </w:pPr>
       <w:r>
-        <w:t>Lọc stopwords (#1 so với #4): chênh +1.05 điểm.</w:t>
+        <w:t>Lọc stopwords (#1 so với #4): CV +1.43 điểm (std ≈ 7.0, nhỏ hơn độ lệch chuẩn giữa các fold, chưa đủ bằng chứng); test +1.28; câu thật +1.79 điểm.</w:t>
       </w:r>
     </w:p>
     <w:p>
@@ -5556,9 +5624,9 @@
       <w:r>
         <w:rPr>
           <w:b w:val="0"/>
-          <w:i/>
+          <w:i w:val="0"/>
         </w:rPr>
-        <w:t>Nhận xét: chênh lệch nào nhỏ hơn độ lệch chuẩn qua các fold thì không đủ bằng chứng để khẳng định bước đó có ích trên bộ dữ liệu này. Nhóm cần diễn giải bảng trên theo số liệu thực tế, không mặc định mọi bước tiền xử lý đều cải thiện kết quả.</w:t>
+        <w:t>Kết luận ablation: mọi chênh lệch CV đều nhỏ hơn độ lệch chuẩn giữa các fold, và dấu của chênh lệch thay đổi giữa CV, test và câu thật. Vì vậy trên bộ dữ liệu này, chưa bước tiền xử lý nào được chứng minh là cải thiện rõ rệt; cấu hình Full được giữ vì hợp lý về mặt ngôn ngữ (tách từ ghép, giữ từ phủ định) chứ không phải vì vượt trội về số liệu. Yếu tố ảnh hưởng lớn hơn nhiều là khác biệt miền giữa dữ liệu synthetic và câu hỏi thật.</w:t>
       </w:r>
     </w:p>
     <w:p>
@@ -5582,7 +5650,7 @@
           <w:b w:val="0"/>
           <w:i w:val="0"/>
         </w:rPr>
-        <w:t>Trên test synthetic, Linear SVM (LinearSVC) sai 22 câu. Accuracy theo văn phong: complaint 86.96%, hr 91.30%, neutral 93.48%, short 91.30%, worker 89.13%.</w:t>
+        <w:t>Trên test synthetic, Linear SVM (LinearSVC) sai 21 câu. Accuracy theo văn phong: khiếu nại 86.96%, nhân sự/HSE 91.30%, trung tính 95.65%, rút gọn 91.30%, công nhân 89.13%. Văn phong khó nhất là khiếu nại, dễ nhất là trung tính.</w:t>
       </w:r>
     </w:p>
     <w:p>
@@ -6682,7 +6750,7 @@
           <w:b w:val="0"/>
           <w:i/>
         </w:rPr>
-        <w:t>Các nguyên nhân lỗi thường gặp (nhóm cần đối chiếu với bảng trên): (1) giao thoa ngữ nghĩa giữa các lớp dùng chung từ vựng, rõ nhất ở cặp BIEN_PHAP_PHONG_NGUA -&gt; QUY_DINH_CHUNG trên test synthetic, và giữa trách nhiệm doanh nghiệp (C5) với chế độ bảo hiểm (C7) trên câu hỏi thật; (2) câu hỏi ngắn thiếu ngữ cảnh; (3) câu hỏi thật hỏi nhiều ý hoặc dẫn chiếu Nghị định/Thông tư; (4) từ ngữ đời thường không có trong tập huấn luyện.</w:t>
+        <w:t>Quan sát: trên test synthetic, lỗi tập trung ở cặp BIEN_PHAP_PHONG_NGUA -&gt; QUY_DINH_CHUNG (cặp lớp này cùng nói về trách nhiệm chung của doanh nghiệp về an toàn, vệ sinh lao động). Trên câu hỏi thật có 6 câu sai, trong đó 3 câu bị đoán thành BAO_HIEM_TNLD. Giả thuyết chưa đo trực tiếp: câu hỏi thật hỏi nhiều ý hoặc dẫn chiếu Nghị định/Thông tư, và dùng từ ngữ không xuất hiện trong tập huấn luyện. Nhóm cần đối chiếu với các bảng ví dụ ở trên.</w:t>
       </w:r>
     </w:p>
     <w:p>
@@ -6747,7 +6815,7 @@
                 <w:b/>
                 <w:sz w:val="22"/>
               </w:rPr>
-              <w:t>test</w:t>
+              <w:t>Test synthetic</w:t>
             </w:r>
           </w:p>
         </w:tc>
@@ -6761,7 +6829,7 @@
                 <w:b/>
                 <w:sz w:val="22"/>
               </w:rPr>
-              <w:t>real</w:t>
+              <w:t>Câu hỏi thật</w:t>
             </w:r>
           </w:p>
         </w:tc>
@@ -6776,7 +6844,7 @@
               <w:rPr>
                 <w:sz w:val="22"/>
               </w:rPr>
-              <w:t>oracle_top1</w:t>
+              <w:t>Oracle Top-1</w:t>
             </w:r>
           </w:p>
         </w:tc>
@@ -6817,7 +6885,7 @@
               <w:rPr>
                 <w:sz w:val="22"/>
               </w:rPr>
-              <w:t>e2e_top1</w:t>
+              <w:t>End-to-end Top-1</w:t>
             </w:r>
           </w:p>
         </w:tc>
@@ -6830,7 +6898,7 @@
               <w:rPr>
                 <w:sz w:val="22"/>
               </w:rPr>
-              <w:t>74.78%</w:t>
+              <w:t>75.22%</w:t>
             </w:r>
           </w:p>
         </w:tc>
@@ -6858,7 +6926,7 @@
               <w:rPr>
                 <w:sz w:val="22"/>
               </w:rPr>
-              <w:t>nofilter_top1</w:t>
+              <w:t>No-filter Top-1</w:t>
             </w:r>
           </w:p>
         </w:tc>
@@ -6899,7 +6967,7 @@
               <w:rPr>
                 <w:sz w:val="22"/>
               </w:rPr>
-              <w:t>oracle_top3</w:t>
+              <w:t>Oracle Top-3</w:t>
             </w:r>
           </w:p>
         </w:tc>
@@ -6940,7 +7008,7 @@
               <w:rPr>
                 <w:sz w:val="22"/>
               </w:rPr>
-              <w:t>e2e_top3</w:t>
+              <w:t>End-to-end Top-3</w:t>
             </w:r>
           </w:p>
         </w:tc>
@@ -6953,7 +7021,7 @@
               <w:rPr>
                 <w:sz w:val="22"/>
               </w:rPr>
-              <w:t>90.00%</w:t>
+              <w:t>90.43%</w:t>
             </w:r>
           </w:p>
         </w:tc>
@@ -6981,7 +7049,7 @@
               <w:rPr>
                 <w:sz w:val="22"/>
               </w:rPr>
-              <w:t>nofilter_top3</w:t>
+              <w:t>No-filter Top-3</w:t>
             </w:r>
           </w:p>
         </w:tc>
@@ -7022,7 +7090,7 @@
               <w:rPr>
                 <w:sz w:val="22"/>
               </w:rPr>
-              <w:t>oracle_top1_multi_article_classes</w:t>
+              <w:t>Oracle Top-1 (lớp nhiều Điều)</w:t>
             </w:r>
           </w:p>
         </w:tc>
@@ -7064,7 +7132,19 @@
           <w:b w:val="0"/>
           <w:i w:val="0"/>
         </w:rPr>
-        <w:t>Oracle (biết đúng lớp): Top-1 = 82.17%, Top-3 = 99.13%. End-to-end (lớp dự đoán): Top-1 = 74.78%. Chênh lệch oracle – end-to-end là lỗi lan truyền từ bộ phân loại. So với tìm trên toàn bộ 62 Điều (Top-1 = 61.74%), bước phân loại giúp thu hẹp không gian tìm kiếm và tăng độ chính xác. Riêng các lớp có nhiều hơn 1 Điều, oracle Top-1 = 76.57%.</w:t>
+        <w:t>Oracle (biết đúng lớp): Top-1 = 82.17%, Top-3 = 99.13%. End-to-end (lớp dự đoán): Top-1 = 75.22%. Chênh lệch oracle – end-to-end là lỗi lan truyền từ bộ phân loại. So với tìm trên toàn bộ 62 Điều (Top-1 = 61.74%), bước phân loại trước tăng Top-1 trên test synthetic. Riêng các lớp có nhiều hơn 1 Điều, oracle Top-1 = 76.57%.</w:t>
+      </w:r>
+    </w:p>
+    <w:p>
+      <w:pPr>
+        <w:spacing w:after="120" w:line="312" w:lineRule="auto"/>
+      </w:pPr>
+      <w:r>
+        <w:rPr>
+          <w:b w:val="0"/>
+          <w:i w:val="0"/>
+        </w:rPr>
+        <w:t>Trên câu hỏi thật: end-to-end Top-1 = 55.17% so với no-filter 44.83%, Top-3 = 75.86% so với 79.31%. Ở Top-3, lọc theo lớp lại kém hơn tìm trên toàn bộ vì khi bộ phân loại đoán sai lớp, Điều đúng bị loại hẳn khỏi danh sách. Lợi ích của bước phân loại vì vậy chỉ rõ ở Top-1.</w:t>
       </w:r>
     </w:p>
     <w:p>
@@ -7076,7 +7156,7 @@
           <w:b w:val="0"/>
           <w:i/>
         </w:rPr>
-        <w:t>Giao diện demo (Streamlit, app.py): người dùng nhập câu hỏi, hệ thống hiển thị nhóm quy định dự đoán, điểm tin cậy tương đối và toàn văn các Điều luật liên quan nhất. [Chèn ảnh chụp màn hình demo]</w:t>
+        <w:t>Giao diện demo (Streamlit, app.py): người dùng nhập câu hỏi, hệ thống hiển thị nhóm quy định dự đoán, điểm tin cậy tương đối (softmax trên điểm quyết định của Linear SVM (LinearSVC), cảnh báo khi dưới 0.4, không từ chối trả lời) và toàn văn các Điều luật liên quan nhất. [Chèn ảnh chụp màn hình demo]</w:t>
       </w:r>
     </w:p>
     <w:p>
@@ -7100,7 +7180,7 @@
           <w:b w:val="0"/>
           <w:i w:val="0"/>
         </w:rPr>
-        <w:t>Trong 110 câu hỏi thật thu thập được có liên quan đến an toàn lao động, 81 câu thực chất thuộc văn bản khác (chủ yếu Luật Bảo hiểm xã hội 2024, Bộ luật Lao động, Nghị định/Thông tư) nên được đánh dấu ngoài phạm vi. Dùng xác suất lớn nhất của Logistic Regression làm độ tin cậy, ngưỡng chọn tại phân vị 5% trên validation (0.232). Tỷ lệ bị từ chối: câu ngoài phạm vi 18.52%, câu thật trong phạm vi 6.90%, test synthetic 5.22%.</w:t>
+        <w:t>Thu thập được 116 câu hỏi thật: 29 câu trong phạm vi, 81 câu ngoài phạm vi, 6 câu hỏi nhiều ý (loại khỏi mọi phép đo). Câu ngoài phạm vi phần lớn thuộc văn bản khác (Luật Bảo hiểm xã hội, Bộ luật Lao động, Nghị định/Thông tư), trong đó 16 câu hoàn toàn khác chủ đề (miễn giảm học phí, tuyển sinh). Thí nghiệm offline (chưa tích hợp vào demo): dùng xác suất lớn nhất của Logistic Regression làm độ tin cậy, ngưỡng chọn tại phân vị 5% trên validation (0.232). Tỷ lệ bị từ chối: câu ngoài phạm vi 18.52%, câu thật trong phạm vi 6.90%, test synthetic 4.78%.</w:t>
       </w:r>
     </w:p>
     <w:p>
@@ -7297,6 +7377,206 @@
       </w:pPr>
       <w:r>
         <w:t>Tái lập: pip install -r requirements.txt; python -m scripts.build_articles; python -m src.dataset; chạy notebook; streamlit run app.py.</w:t>
+      </w:r>
+    </w:p>
+    <w:p>
+      <w:pPr>
+        <w:spacing w:after="120" w:line="312" w:lineRule="auto"/>
+      </w:pPr>
+      <w:r>
+        <w:rPr>
+          <w:b/>
+          <w:i w:val="0"/>
+        </w:rPr>
+        <w:t>A. Pipeline TF-IDF + mô hình (src/models.py)</w:t>
+      </w:r>
+    </w:p>
+    <w:p>
+      <w:r>
+        <w:rPr>
+          <w:rFonts w:ascii="Consolas" w:hAnsi="Consolas"/>
+          <w:sz w:val="18"/>
+        </w:rPr>
+        <w:t>def tfidf(ngram=(1, 2)) -&gt; TfidfVectorizer:</w:t>
+        <w:br/>
+        <w:t xml:space="preserve">    # token_pattern mặc định bỏ token 1 ký tự; giữ mọi chuỗi không trắng để không mất âm tiết/từ ghép "_".</w:t>
+        <w:br/>
+        <w:t xml:space="preserve">    return TfidfVectorizer(ngram_range=ngram, sublinear_tf=True, min_df=2, max_features=5000,</w:t>
+        <w:br/>
+        <w:t xml:space="preserve">                           token_pattern=r"(?u)\S+", lowercase=False)</w:t>
+      </w:r>
+    </w:p>
+    <w:p>
+      <w:pPr>
+        <w:spacing w:after="120" w:line="312" w:lineRule="auto"/>
+      </w:pPr>
+      <w:r>
+        <w:rPr>
+          <w:b/>
+          <w:i w:val="0"/>
+        </w:rPr>
+        <w:t>B. GridSearchCV với StratifiedGroupKFold (src/models.py)</w:t>
+      </w:r>
+    </w:p>
+    <w:p>
+      <w:r>
+        <w:rPr>
+          <w:rFonts w:ascii="Consolas" w:hAnsi="Consolas"/>
+          <w:sz w:val="18"/>
+        </w:rPr>
+        <w:t>def grid_search(pipe: Pipeline, grid: dict, X, y, groups) -&gt; GridSearchCV:</w:t>
+        <w:br/>
+        <w:t xml:space="preserve">    cv = StratifiedGroupKFold(n_splits=5, shuffle=True, random_state=RANDOM_STATE)</w:t>
+        <w:br/>
+        <w:t xml:space="preserve">    gs = GridSearchCV(pipe, grid, scoring="f1_macro", cv=cv, n_jobs=-1, refit=True, return_train_score=True)</w:t>
+        <w:br/>
+        <w:t xml:space="preserve">    gs.fit(X, y, groups=groups)</w:t>
+        <w:br/>
+        <w:t xml:space="preserve">    return gs</w:t>
+      </w:r>
+    </w:p>
+    <w:p>
+      <w:pPr>
+        <w:spacing w:after="120" w:line="312" w:lineRule="auto"/>
+      </w:pPr>
+      <w:r>
+        <w:rPr>
+          <w:b/>
+          <w:i w:val="0"/>
+        </w:rPr>
+        <w:t>C. Tính Macro-F1 (src/models.py)</w:t>
+      </w:r>
+    </w:p>
+    <w:p>
+      <w:r>
+        <w:rPr>
+          <w:rFonts w:ascii="Consolas" w:hAnsi="Consolas"/>
+          <w:sz w:val="18"/>
+        </w:rPr>
+        <w:t>def scores(y_true, y_pred) -&gt; dict:</w:t>
+        <w:br/>
+        <w:t xml:space="preserve">    # Cố định tập nhãn = các lớp có trong y_true: nếu không, mẫu số macro thay đổi theo lớp mà model dự đoán</w:t>
+        <w:br/>
+        <w:t xml:space="preserve">    # (vd test thật thiếu C2, model đoán nhầm vào C2 thì C2 bị tính thêm với F1=0).</w:t>
+        <w:br/>
+        <w:t xml:space="preserve">    labels = sorted(set(y_true))</w:t>
+        <w:br/>
+        <w:t xml:space="preserve">    p, r, f, _ = precision_recall_fscore_support(y_true, y_pred, labels=labels, average="macro", zero_division=0)</w:t>
+        <w:br/>
+        <w:t xml:space="preserve">    return {"accuracy": accuracy_score(y_true, y_pred), "macro_precision": p, "macro_recall": r, "macro_f1": f}</w:t>
+      </w:r>
+    </w:p>
+    <w:p>
+      <w:pPr>
+        <w:spacing w:after="120" w:line="312" w:lineRule="auto"/>
+      </w:pPr>
+      <w:r>
+        <w:rPr>
+          <w:b/>
+          <w:i w:val="0"/>
+        </w:rPr>
+        <w:t>D. Chia train/val/test theo câu gốc (src/dataset.py)</w:t>
+      </w:r>
+    </w:p>
+    <w:p>
+      <w:r>
+        <w:rPr>
+          <w:rFonts w:ascii="Consolas" w:hAnsi="Consolas"/>
+          <w:sz w:val="18"/>
+        </w:rPr>
+        <w:t>def group_split(df: pd.DataFrame, test_frac: float = 0.15, val_frac: float = 0.15) -&gt; pd.Series:</w:t>
+        <w:br/>
+        <w:t xml:space="preserve">    """Gán 'train'/'val'/'test' sao cho mọi câu cùng seed_id nằm chung 1 tập, giữ tỷ lệ lớp.</w:t>
+        <w:br/>
+        <w:br/>
+        <w:t xml:space="preserve">    Dùng StratifiedGroupKFold: tách test = 1 fold trong ~1/test_frac folds, rồi tách val từ phần còn lại.</w:t>
+        <w:br/>
+        <w:t xml:space="preserve">    """</w:t>
+        <w:br/>
+        <w:t xml:space="preserve">    split = pd.Series("train", index=df.index)</w:t>
+        <w:br/>
+        <w:t xml:space="preserve">    y, g = df["label_id"].to_numpy(), df["seed_id"].to_numpy()</w:t>
+        <w:br/>
+        <w:br/>
+        <w:t xml:space="preserve">    n_test = round(1 / test_frac)</w:t>
+        <w:br/>
+        <w:t xml:space="preserve">    sgkf = StratifiedGroupKFold(n_splits=n_test, shuffle=True, random_state=RANDOM_STATE)</w:t>
+        <w:br/>
+        <w:t xml:space="preserve">    rest_idx, test_idx = next(sgkf.split(df, y, g))</w:t>
+        <w:br/>
+        <w:t xml:space="preserve">    split.iloc[test_idx] = "test"</w:t>
+        <w:br/>
+        <w:br/>
+        <w:t xml:space="preserve">    n_val = round((1 - test_frac) / val_frac)</w:t>
+        <w:br/>
+        <w:t xml:space="preserve">    sgkf2 = StratifiedGroupKFold(n_splits=n_val, shuffle=True, random_state=RANDOM_STATE)</w:t>
+        <w:br/>
+        <w:t xml:space="preserve">    tr_rel, val_rel = next(sgkf2.split(rest_idx, y[rest_idx], g[rest_idx]))</w:t>
+        <w:br/>
+        <w:t xml:space="preserve">    split.iloc[rest_idx[val_rel]] = "val"</w:t>
+        <w:br/>
+        <w:br/>
+        <w:t xml:space="preserve">    # Bất biến chống leakage: không seed nào xuất hiện ở 2 tập.</w:t>
+        <w:br/>
+        <w:t xml:space="preserve">    seeds = {s: set(df.loc[split == s, "seed_id"]) for s in ("train", "val", "test")}</w:t>
+        <w:br/>
+        <w:t xml:space="preserve">    assert not (seeds["train"] &amp; seeds["val"] or seeds["train"] &amp; seeds["test"] or seeds["val"] &amp; seeds["test"])</w:t>
+        <w:br/>
+        <w:t xml:space="preserve">    return split</w:t>
+      </w:r>
+    </w:p>
+    <w:p>
+      <w:pPr>
+        <w:spacing w:after="120" w:line="312" w:lineRule="auto"/>
+      </w:pPr>
+      <w:r>
+        <w:rPr>
+          <w:b/>
+          <w:i w:val="0"/>
+        </w:rPr>
+        <w:t>E. Tra cứu Điều luật (src/retrieval.py)</w:t>
+      </w:r>
+    </w:p>
+    <w:p>
+      <w:r>
+        <w:rPr>
+          <w:rFonts w:ascii="Consolas" w:hAnsi="Consolas"/>
+          <w:sz w:val="18"/>
+        </w:rPr>
+        <w:t>class ArticleRetriever:</w:t>
+        <w:br/>
+        <w:t xml:space="preserve">    def __init__(self, articles: list[dict] | None = None):</w:t>
+        <w:br/>
+        <w:t xml:space="preserve">        if articles is None:</w:t>
+        <w:br/>
+        <w:t xml:space="preserve">            articles = json.loads(ARTICLES_PATH.read_text(encoding="utf-8"))["articles"]</w:t>
+        <w:br/>
+        <w:t xml:space="preserve">        self.articles = {a["article_id"]: a for a in articles if a["article_id"] in ARTICLE_TO_LABEL}</w:t>
+        <w:br/>
+        <w:t xml:space="preserve">        self.ids = sorted(self.articles)</w:t>
+        <w:br/>
+        <w:t xml:space="preserve">        docs = [preprocess(f"{self.articles[i]['title']}. {self.articles[i]['title']}. {self.articles[i]['text']}")</w:t>
+        <w:br/>
+        <w:t xml:space="preserve">                for i in self.ids]  # lặp tiêu đề 2 lần: tiêu đề mang nhiều tín hiệu nhất</w:t>
+        <w:br/>
+        <w:t xml:space="preserve">        self.vec = TfidfVectorizer(ngram_range=(1, 2), sublinear_tf=True, token_pattern=r"(?u)\S+",</w:t>
+        <w:br/>
+        <w:t xml:space="preserve">                                   lowercase=False)</w:t>
+        <w:br/>
+        <w:t xml:space="preserve">        self.doc_matrix = self.vec.fit_transform(docs)</w:t>
+        <w:br/>
+        <w:t xml:space="preserve">        self.label_of = np.array([ARTICLE_TO_LABEL[i] for i in self.ids])</w:t>
+        <w:br/>
+        <w:br/>
+        <w:t xml:space="preserve">    def rank(self, question_clean: str, label_id: int | None = None, k: int = 3) -&gt; list[tuple[int, float]]:</w:t>
+        <w:br/>
+        <w:t xml:space="preserve">        sims = cosine_similarity(self.vec.transform([question_clean]), self.doc_matrix).ravel()</w:t>
+        <w:br/>
+        <w:t xml:space="preserve">        mask = np.ones_like(sims, dtype=bool) if label_id is None else self.label_of == label_id</w:t>
+        <w:br/>
+        <w:t xml:space="preserve">        order = [j for j in np.argsort(-sims) if mask[j]][:k]</w:t>
+        <w:br/>
+        <w:t xml:space="preserve">        return [(self.ids[j], float(sims[j])) for j in order]</w:t>
       </w:r>
     </w:p>
     <w:p>

</xml_diff>

<commit_message>
docs: disclose LLM-generated data and labels, add team todo and review sheets
</commit_message>
<xml_diff>
--- a/reports/BaoCao_DoAn_MayHoc.docx
+++ b/reports/BaoCao_DoAn_MayHoc.docx
@@ -1444,6 +1444,18 @@
           <w:b w:val="0"/>
           <w:i w:val="0"/>
         </w:rPr>
+        <w:t>Nguồn gốc dữ liệu và nhãn (công khai): toàn bộ câu hỏi synthetic do mô hình ngôn ngữ lớn (Claude) sinh, theo hướng dẫn gán nhãn của nhóm (docs/labeling-guidelines.md): với mỗi Điều, mô hình viết câu hỏi gốc có căn cứ trong Điều đó rồi viết 4 biến thể văn phong. Nhãn lớp không do mô hình chọn mà suy ra tự động từ Điều. Dữ liệu được kiểm bằng script tự động (scripts/validate_generated.py): đủ 40 câu gốc mỗi lớp, mỗi câu gốc đủ 5 văn phong cùng một Điều, Điều thuộc đúng lớp, mọi Điều của lớp đều có câu hỏi, không có câu trùng, độ dài 2–60 từ. Các câu dễ nhầm lớp được ghi lý do chọn Điều trong data/raw/gen/hard_c*.md. Chưa đo độ đồng thuận giữa người gán nhãn. [NHÓM ĐIỀN SAU KHI REVIEW, xem docs/team-todo.md: nhóm đã đọc kiểm tra N câu gốc, phát hiện X câu sai, đã sửa/loại Y câu.]</w:t>
+      </w:r>
+    </w:p>
+    <w:p>
+      <w:pPr>
+        <w:spacing w:after="120" w:line="312" w:lineRule="auto"/>
+      </w:pPr>
+      <w:r>
+        <w:rPr>
+          <w:b w:val="0"/>
+          <w:i w:val="0"/>
+        </w:rPr>
         <w:t>Dữ liệu được chia Train/Validation/Test ≈ 70/15/15 bằng StratifiedGroupKFold với nhóm là câu gốc: mọi biến thể của cùng một câu gốc nằm trong cùng một tập. Nếu chia ngẫu nhiên, các câu paraphrase gần giống nhau sẽ xuất hiện ở cả train và test, làm kết quả bị thổi phồng. Notebook kiểm tra giao các nhóm giữa ba tập bằng rỗng.</w:t>
       </w:r>
     </w:p>
@@ -2041,6 +2053,18 @@
           <w:i w:val="0"/>
         </w:rPr>
         <w:t>Tập test thật gồm 29 câu hỏi thực tế từ chinhsachonline.chinhphu.vn, nhãn lấy theo Điều của Luật ATVSLĐ mà cơ quan nhà nước viện dẫn trong câu trả lời. Tập này không được dùng khi huấn luyện hay chọn mô hình. Phân bố lớp lệch (số câu mỗi lớp: 1, 10, 0, 2, 1, 9, 1, 5). Không có câu nào thuộc PHUONG_TIEN_BAO_HO. Đây là các câu còn lại sau khi lọc, không phải mẫu đại diện cho tần suất nhu cầu hỏi thực tế.</w:t>
+      </w:r>
+    </w:p>
+    <w:p>
+      <w:pPr>
+        <w:spacing w:after="120" w:line="312" w:lineRule="auto"/>
+      </w:pPr>
+      <w:r>
+        <w:rPr>
+          <w:b w:val="0"/>
+          <w:i w:val="0"/>
+        </w:rPr>
+        <w:t>Nhãn câu hỏi thật do mô hình ngôn ngữ lớn (GPT) gán: đọc câu hỏi cùng câu trả lời của cơ quan nhà nước, chọn trong phạm vi / ngoài phạm vi / nhiều ý và Điều được viện dẫn, kèm trích dẫn làm căn cứ (data/raw/real_labeled.jsonl). [NHÓM ĐIỀN SAU KHI REVIEW, xem docs/team-todo.md: 9 dòng mô hình không chắc chắn đã được nhóm review thủ công theo docs/real-label-review.md, đổi X nhãn.]</w:t>
       </w:r>
     </w:p>
     <w:p>
@@ -7280,7 +7304,7 @@
           <w:b w:val="0"/>
           <w:i w:val="0"/>
         </w:rPr>
-        <w:t>Hạn chế: dữ liệu huấn luyện được sinh tự động nên văn phong đồng đều hơn thực tế; tập câu hỏi thật nhỏ; chưa xử lý câu hỏi nhiều ý và câu ngoài phạm vi (Điều 63–93); chưa tích hợp mức xử phạt hành chính.</w:t>
+        <w:t>Hạn chế: dữ liệu huấn luyện do mô hình ngôn ngữ lớn sinh nên văn phong đồng đều hơn thực tế và có thể mang thiên lệch của mô hình sinh; nhãn câu hỏi thật do mô hình gán, người chỉ review các dòng không chắc chắn; tập câu hỏi thật nhỏ; chưa xử lý câu hỏi nhiều ý và câu ngoài phạm vi (Điều 63–93); chưa tích hợp mức xử phạt hành chính.</w:t>
       </w:r>
     </w:p>
     <w:p>

</xml_diff>

<commit_message>
docs: rebuild report, slides and notebook on expanded real set
Report fills label agreement from reports/agreement.json when present; team-todo describes blind labeling.
</commit_message>
<xml_diff>
--- a/reports/BaoCao_DoAn_MayHoc.docx
+++ b/reports/BaoCao_DoAn_MayHoc.docx
@@ -181,7 +181,7 @@
           <w:b w:val="0"/>
           <w:i w:val="0"/>
         </w:rPr>
-        <w:t>Bộ dữ liệu gồm 1600 câu hỏi (320 câu gốc × 5 văn phong) được sinh có kiểm soát từ nội dung từng Điều luật, chia Train/Val/Test theo nhóm câu gốc để tránh rò rỉ dữ liệu, cùng 29 câu hỏi thật của người dân từ Cổng Hỏi đáp chính sách Chính phủ làm tập kiểm tra độc lập.</w:t>
+        <w:t>Bộ dữ liệu gồm 1600 câu hỏi (320 câu gốc × 5 văn phong) được sinh có kiểm soát từ nội dung từng Điều luật, chia Train/Val/Test theo nhóm câu gốc để tránh rò rỉ dữ liệu, cùng 42 câu hỏi thật của người dân từ Cổng Hỏi đáp chính sách Chính phủ làm tập kiểm tra độc lập.</w:t>
       </w:r>
     </w:p>
     <w:p>
@@ -193,7 +193,7 @@
           <w:b w:val="0"/>
           <w:i w:val="0"/>
         </w:rPr>
-        <w:t>Bốn mô hình được so sánh: Multinomial Naive Bayes, Logistic Regression, LinearSVC và Random Forest, tinh chỉnh bằng GridSearchCV với StratifiedGroupKFold. Mô hình có Macro-F1 cao nhất trên tập validation là Linear SVM (LinearSVC) (val Macro-F1 = 86.93%, test Macro-F1 = 90.51%, câu hỏi thật Macro-F1 = 60.54%, tính trên các lớp có mặt trong tập thật).</w:t>
+        <w:t>Bốn mô hình được so sánh: Multinomial Naive Bayes, Logistic Regression, LinearSVC và Random Forest, tinh chỉnh bằng GridSearchCV với StratifiedGroupKFold. Mô hình có Macro-F1 cao nhất trên tập validation là Linear SVM (LinearSVC) (val Macro-F1 = 86.93%, test Macro-F1 = 90.51%, câu hỏi thật Macro-F1 = 62.00%, tính trên các lớp có mặt trong tập thật).</w:t>
       </w:r>
     </w:p>
     <w:p>
@@ -2052,7 +2052,7 @@
           <w:b w:val="0"/>
           <w:i w:val="0"/>
         </w:rPr>
-        <w:t>Tập test thật gồm 29 câu hỏi thực tế từ chinhsachonline.chinhphu.vn, nhãn lấy theo Điều của Luật ATVSLĐ mà cơ quan nhà nước viện dẫn trong câu trả lời. Tập này không được dùng khi huấn luyện hay chọn mô hình. Phân bố lớp lệch (số câu mỗi lớp: 1, 10, 0, 2, 1, 9, 1, 5). Không có câu nào thuộc PHUONG_TIEN_BAO_HO. Đây là các câu còn lại sau khi lọc, không phải mẫu đại diện cho tần suất nhu cầu hỏi thực tế.</w:t>
+        <w:t>Tập test thật gồm 42 câu hỏi thực tế từ chinhsachonline.chinhphu.vn, nhãn lấy theo Điều của Luật ATVSLĐ mà cơ quan nhà nước viện dẫn trong câu trả lời. Tập này không được dùng khi huấn luyện hay chọn mô hình. Phân bố lớp lệch (số câu mỗi lớp: 1, 10, 0, 3, 1, 15, 1, 11). Không có câu nào thuộc PHUONG_TIEN_BAO_HO. Đây là các câu còn lại sau khi lọc, không phải mẫu đại diện cho tần suất nhu cầu hỏi thực tế.</w:t>
       </w:r>
     </w:p>
     <w:p>
@@ -2064,7 +2064,19 @@
           <w:b w:val="0"/>
           <w:i w:val="0"/>
         </w:rPr>
-        <w:t>Nhãn câu hỏi thật do mô hình ngôn ngữ lớn (GPT) gán: đọc câu hỏi cùng câu trả lời của cơ quan nhà nước, chọn trong phạm vi / ngoài phạm vi / nhiều ý và Điều được viện dẫn, kèm trích dẫn làm căn cứ (data/raw/real_labeled.jsonl). [NHÓM ĐIỀN SAU KHI REVIEW, xem docs/team-todo.md: 9 dòng mô hình không chắc chắn đã được nhóm review thủ công theo docs/real-label-review.md, đổi X nhãn.]</w:t>
+        <w:t>Nhãn câu hỏi thật do mô hình ngôn ngữ lớn (GPT) gán: đọc câu hỏi cùng câu trả lời của cơ quan nhà nước, chọn trong phạm vi / ngoài phạm vi / nhiều ý và Điều được viện dẫn, kèm trích dẫn làm căn cứ (data/raw/real_labeled.jsonl).</w:t>
+      </w:r>
+    </w:p>
+    <w:p>
+      <w:pPr>
+        <w:spacing w:after="120" w:line="312" w:lineRule="auto"/>
+      </w:pPr>
+      <w:r>
+        <w:rPr>
+          <w:b w:val="0"/>
+          <w:i/>
+        </w:rPr>
+        <w:t>[NHÓM ĐIỀN SAU KHI GÁN NHÃN MÙ, xem docs/team-todo.md mục A: chạy `python -m scripts.blind_labeling score` rồi build lại báo cáo, đoạn này sẽ tự điền số đồng thuận.]</w:t>
       </w:r>
     </w:p>
     <w:p>
@@ -2140,7 +2152,7 @@
           <w:b w:val="0"/>
           <w:i w:val="0"/>
         </w:rPr>
-        <w:t>Độ dài câu hỏi trung bình 20.5 âm tiết (min 5.0, max 42.0). Văn phong rút gọn ngắn nhất (7.2), văn phong nhân sự/HSE dài nhất (29.2). Câu hỏi thật có độ dài trung bình 127.3 âm tiết, dài hơn nhiều so với dữ liệu synthetic, thường kèm bối cảnh cụ thể.</w:t>
+        <w:t>Độ dài câu hỏi trung bình 20.5 âm tiết (min 5.0, max 42.0). Văn phong rút gọn ngắn nhất (7.2), văn phong nhân sự/HSE dài nhất (29.2). Câu hỏi thật có độ dài trung bình 106.2 âm tiết, dài hơn nhiều so với dữ liệu synthetic, thường kèm bối cảnh cụ thể.</w:t>
       </w:r>
     </w:p>
     <w:p>
@@ -2944,7 +2956,7 @@
               <w:rPr>
                 <w:sz w:val="22"/>
               </w:rPr>
-              <w:t>2.0</w:t>
+              <w:t>1.8</w:t>
             </w:r>
           </w:p>
         </w:tc>
@@ -3052,7 +3064,7 @@
               <w:rPr>
                 <w:sz w:val="22"/>
               </w:rPr>
-              <w:t>0.5</w:t>
+              <w:t>0.4</w:t>
             </w:r>
           </w:p>
         </w:tc>
@@ -3106,7 +3118,7 @@
               <w:rPr>
                 <w:sz w:val="22"/>
               </w:rPr>
-              <w:t>3.2</w:t>
+              <w:t>3.3</w:t>
             </w:r>
           </w:p>
         </w:tc>
@@ -3385,7 +3397,7 @@
               <w:rPr>
                 <w:sz w:val="22"/>
               </w:rPr>
-              <w:t>75.86%</w:t>
+              <w:t>78.57%</w:t>
             </w:r>
           </w:p>
         </w:tc>
@@ -3398,7 +3410,7 @@
               <w:rPr>
                 <w:sz w:val="22"/>
               </w:rPr>
-              <w:t>53.03%</w:t>
+              <w:t>54.81%</w:t>
             </w:r>
           </w:p>
         </w:tc>
@@ -3504,7 +3516,7 @@
               <w:rPr>
                 <w:sz w:val="22"/>
               </w:rPr>
-              <w:t>75.86%</w:t>
+              <w:t>73.81%</w:t>
             </w:r>
           </w:p>
         </w:tc>
@@ -3517,7 +3529,7 @@
               <w:rPr>
                 <w:sz w:val="22"/>
               </w:rPr>
-              <w:t>58.86%</w:t>
+              <w:t>60.30%</w:t>
             </w:r>
           </w:p>
         </w:tc>
@@ -3623,7 +3635,7 @@
               <w:rPr>
                 <w:sz w:val="22"/>
               </w:rPr>
-              <w:t>79.31%</w:t>
+              <w:t>78.57%</w:t>
             </w:r>
           </w:p>
         </w:tc>
@@ -3636,7 +3648,7 @@
               <w:rPr>
                 <w:sz w:val="22"/>
               </w:rPr>
-              <w:t>60.54%</w:t>
+              <w:t>62.00%</w:t>
             </w:r>
           </w:p>
         </w:tc>
@@ -3742,7 +3754,7 @@
               <w:rPr>
                 <w:sz w:val="22"/>
               </w:rPr>
-              <w:t>65.52%</w:t>
+              <w:t>66.67%</w:t>
             </w:r>
           </w:p>
         </w:tc>
@@ -3755,7 +3767,7 @@
               <w:rPr>
                 <w:sz w:val="22"/>
               </w:rPr>
-              <w:t>46.98%</w:t>
+              <w:t>51.16%</w:t>
             </w:r>
           </w:p>
         </w:tc>
@@ -3847,7 +3859,7 @@
           <w:b w:val="0"/>
           <w:i w:val="0"/>
         </w:rPr>
-        <w:t>Macro-F1 trên câu hỏi thật chỉ tính trên các lớp có mặt trong 29 câu (vắng PHUONG_TIEN_BAO_HO), còn Macro-F1 trên test synthetic tính trên đủ 8 lớp. Hai con số không cùng tập lớp nên chỉ so sánh tương đối.</w:t>
+        <w:t>Macro-F1 trên câu hỏi thật chỉ tính trên các lớp có mặt trong 42 câu (vắng PHUONG_TIEN_BAO_HO), còn Macro-F1 trên test synthetic tính trên đủ 8 lớp. Hai con số không cùng tập lớp nên chỉ so sánh tương đối.</w:t>
       </w:r>
     </w:p>
     <w:p>
@@ -4922,7 +4934,7 @@
           <w:b w:val="0"/>
           <w:i w:val="0"/>
         </w:rPr>
-        <w:t>Khoảng cách quan trọng nhất là giữa test synthetic và câu hỏi thật: Macro-F1 của Linear SVM (LinearSVC) giảm 29.97 điểm. Giả thuyết: domain shift (câu hỏi thật dài hơn, nhiều bối cảnh, dùng từ ngữ của Nghị định/Thông tư, phân bố lớp khác). Lưu ý tập thật chỉ có 29 câu nên số liệu dao động lớn.</w:t>
+        <w:t>Khoảng cách quan trọng nhất là giữa test synthetic và câu hỏi thật: Macro-F1 của Linear SVM (LinearSVC) giảm 28.50 điểm. Giả thuyết: domain shift (câu hỏi thật dài hơn, nhiều bối cảnh, dùng từ ngữ của Nghị định/Thông tư, phân bố lớp khác). Lưu ý tập thật chỉ có 42 câu nên số liệu dao động lớn.</w:t>
       </w:r>
     </w:p>
     <w:p>
@@ -5225,7 +5237,7 @@
               <w:rPr>
                 <w:sz w:val="22"/>
               </w:rPr>
-              <w:t>60.54%</w:t>
+              <w:t>62.00%</w:t>
             </w:r>
           </w:p>
         </w:tc>
@@ -5305,7 +5317,7 @@
               <w:rPr>
                 <w:sz w:val="22"/>
               </w:rPr>
-              <w:t>57.07%</w:t>
+              <w:t>58.59%</w:t>
             </w:r>
           </w:p>
         </w:tc>
@@ -5385,7 +5397,7 @@
               <w:rPr>
                 <w:sz w:val="22"/>
               </w:rPr>
-              <w:t>58.75%</w:t>
+              <w:t>60.93%</w:t>
             </w:r>
           </w:p>
         </w:tc>
@@ -5465,7 +5477,7 @@
               <w:rPr>
                 <w:sz w:val="22"/>
               </w:rPr>
-              <w:t>58.75%</w:t>
+              <w:t>62.04%</w:t>
             </w:r>
           </w:p>
         </w:tc>
@@ -5545,7 +5557,7 @@
               <w:rPr>
                 <w:sz w:val="22"/>
               </w:rPr>
-              <w:t>52.17%</w:t>
+              <w:t>55.49%</w:t>
             </w:r>
           </w:p>
         </w:tc>
@@ -5622,7 +5634,7 @@
         <w:pStyle w:val="ListBullet"/>
       </w:pPr>
       <w:r>
-        <w:t>Tách từ tiếng Việt (#4 so với #2): CV -0.76 điểm (std ≈ 7.0, nhỏ hơn độ lệch chuẩn giữa các fold, chưa đủ bằng chứng); test -3.70; câu thật +1.68 điểm.</w:t>
+        <w:t>Tách từ tiếng Việt (#4 so với #2): CV -0.76 điểm (std ≈ 7.0, nhỏ hơn độ lệch chuẩn giữa các fold, chưa đủ bằng chứng); test -3.70; câu thật +3.45 điểm.</w:t>
       </w:r>
     </w:p>
     <w:p>
@@ -5630,7 +5642,7 @@
         <w:pStyle w:val="ListBullet"/>
       </w:pPr>
       <w:r>
-        <w:t>Bigram (#1 so với #3): CV -0.36 điểm (std ≈ 6.6, nhỏ hơn độ lệch chuẩn giữa các fold, chưa đủ bằng chứng); test +2.45; câu thật +1.79 điểm.</w:t>
+        <w:t>Bigram (#1 so với #3): CV -0.36 điểm (std ≈ 6.6, nhỏ hơn độ lệch chuẩn giữa các fold, chưa đủ bằng chứng); test +2.45; câu thật +1.07 điểm.</w:t>
       </w:r>
     </w:p>
     <w:p>
@@ -5638,7 +5650,7 @@
         <w:pStyle w:val="ListBullet"/>
       </w:pPr>
       <w:r>
-        <w:t>Lọc stopwords (#1 so với #4): CV +1.43 điểm (std ≈ 7.0, nhỏ hơn độ lệch chuẩn giữa các fold, chưa đủ bằng chứng); test +1.28; câu thật +1.79 điểm.</w:t>
+        <w:t>Lọc stopwords (#1 so với #4): CV +1.43 điểm (std ≈ 7.0, nhỏ hơn độ lệch chuẩn giữa các fold, chưa đủ bằng chứng); test +1.28; câu thật -0.04 điểm.</w:t>
       </w:r>
     </w:p>
     <w:p>
@@ -6763,6 +6775,114 @@
           </w:p>
         </w:tc>
       </w:tr>
+      <w:tr>
+        <w:tc>
+          <w:tcPr>
+            <w:tcW w:type="dxa" w:w="2351"/>
+          </w:tcPr>
+          <w:p>
+            <w:r>
+              <w:rPr>
+                <w:sz w:val="22"/>
+              </w:rPr>
+              <w:t>Tôi làm việc tại nhà máy sản xuất tinh bột mỳ theo hợp đồng lao động ký với nhà máy là 1 năm. Trong lúc kiểm tra tinh bột mỳ vào thiết bị sấy, tôi bị bột mỳ bắn vào mặt và bị ngã gãy tay. Tuy nhiên tôi không được giải quyết chế độ tai nạn lao động vì nhà máy không đóng BHXH cho tôi. Vậy, tôi phải là</w:t>
+            </w:r>
+          </w:p>
+        </w:tc>
+        <w:tc>
+          <w:tcPr>
+            <w:tcW w:type="dxa" w:w="2351"/>
+          </w:tcPr>
+          <w:p>
+            <w:r>
+              <w:rPr>
+                <w:sz w:val="22"/>
+              </w:rPr>
+              <w:t>39</w:t>
+            </w:r>
+          </w:p>
+        </w:tc>
+        <w:tc>
+          <w:tcPr>
+            <w:tcW w:type="dxa" w:w="2351"/>
+          </w:tcPr>
+          <w:p>
+            <w:r>
+              <w:rPr>
+                <w:sz w:val="22"/>
+              </w:rPr>
+              <w:t>CHE_DO_BOI_THUONG</w:t>
+            </w:r>
+          </w:p>
+        </w:tc>
+        <w:tc>
+          <w:tcPr>
+            <w:tcW w:type="dxa" w:w="2351"/>
+          </w:tcPr>
+          <w:p>
+            <w:r>
+              <w:rPr>
+                <w:sz w:val="22"/>
+              </w:rPr>
+              <w:t>BAO_HIEM_TNLD</w:t>
+            </w:r>
+          </w:p>
+        </w:tc>
+      </w:tr>
+      <w:tr>
+        <w:tc>
+          <w:tcPr>
+            <w:tcW w:type="dxa" w:w="2351"/>
+          </w:tcPr>
+          <w:p>
+            <w:r>
+              <w:rPr>
+                <w:sz w:val="22"/>
+              </w:rPr>
+              <w:t>Tôi xin hỏi, người lao động làm công việc cung cấp thức ăn cho khách trên tàu hỏa bị đột quỵ chết trong giờ làm việc thì có được tính là tai nạn lao động không? Công việc phục vụ hành khách trên các đoàn tàu hỏa có phải công việc nặng nhọc không?</w:t>
+            </w:r>
+          </w:p>
+        </w:tc>
+        <w:tc>
+          <w:tcPr>
+            <w:tcW w:type="dxa" w:w="2351"/>
+          </w:tcPr>
+          <w:p>
+            <w:r>
+              <w:rPr>
+                <w:sz w:val="22"/>
+              </w:rPr>
+              <w:t>40</w:t>
+            </w:r>
+          </w:p>
+        </w:tc>
+        <w:tc>
+          <w:tcPr>
+            <w:tcW w:type="dxa" w:w="2351"/>
+          </w:tcPr>
+          <w:p>
+            <w:r>
+              <w:rPr>
+                <w:sz w:val="22"/>
+              </w:rPr>
+              <w:t>CHE_DO_BOI_THUONG</w:t>
+            </w:r>
+          </w:p>
+        </w:tc>
+        <w:tc>
+          <w:tcPr>
+            <w:tcW w:type="dxa" w:w="2351"/>
+          </w:tcPr>
+          <w:p>
+            <w:r>
+              <w:rPr>
+                <w:sz w:val="22"/>
+              </w:rPr>
+              <w:t>KHAI_BAO_DIEU_TRA</w:t>
+            </w:r>
+          </w:p>
+        </w:tc>
+      </w:tr>
     </w:tbl>
     <w:p/>
     <w:p>
@@ -6774,7 +6894,7 @@
           <w:b w:val="0"/>
           <w:i/>
         </w:rPr>
-        <w:t>Quan sát: trên test synthetic, lỗi tập trung ở cặp BIEN_PHAP_PHONG_NGUA -&gt; QUY_DINH_CHUNG (cặp lớp này cùng nói về trách nhiệm chung của doanh nghiệp về an toàn, vệ sinh lao động). Trên câu hỏi thật có 6 câu sai, trong đó 3 câu bị đoán thành BAO_HIEM_TNLD. Giả thuyết chưa đo trực tiếp: câu hỏi thật hỏi nhiều ý hoặc dẫn chiếu Nghị định/Thông tư, và dùng từ ngữ không xuất hiện trong tập huấn luyện. Nhóm cần đối chiếu với các bảng ví dụ ở trên.</w:t>
+        <w:t>Quan sát: trên test synthetic, lỗi tập trung ở cặp BIEN_PHAP_PHONG_NGUA -&gt; QUY_DINH_CHUNG (cặp lớp này cùng nói về trách nhiệm chung của doanh nghiệp về an toàn, vệ sinh lao động). Trên câu hỏi thật có 9 câu sai, trong đó 4 câu bị đoán thành BAO_HIEM_TNLD. Giả thuyết chưa đo trực tiếp: câu hỏi thật hỏi nhiều ý hoặc dẫn chiếu Nghị định/Thông tư, và dùng từ ngữ không xuất hiện trong tập huấn luyện. Nhóm cần đối chiếu với các bảng ví dụ ở trên.</w:t>
       </w:r>
     </w:p>
     <w:p>
@@ -6894,7 +7014,7 @@
               <w:rPr>
                 <w:sz w:val="22"/>
               </w:rPr>
-              <w:t>65.52%</w:t>
+              <w:t>59.52%</w:t>
             </w:r>
           </w:p>
         </w:tc>
@@ -6935,7 +7055,7 @@
               <w:rPr>
                 <w:sz w:val="22"/>
               </w:rPr>
-              <w:t>55.17%</w:t>
+              <w:t>50.00%</w:t>
             </w:r>
           </w:p>
         </w:tc>
@@ -6976,7 +7096,7 @@
               <w:rPr>
                 <w:sz w:val="22"/>
               </w:rPr>
-              <w:t>44.83%</w:t>
+              <w:t>42.86%</w:t>
             </w:r>
           </w:p>
         </w:tc>
@@ -7017,7 +7137,7 @@
               <w:rPr>
                 <w:sz w:val="22"/>
               </w:rPr>
-              <w:t>96.55%</w:t>
+              <w:t>92.86%</w:t>
             </w:r>
           </w:p>
         </w:tc>
@@ -7058,7 +7178,7 @@
               <w:rPr>
                 <w:sz w:val="22"/>
               </w:rPr>
-              <w:t>75.86%</w:t>
+              <w:t>71.43%</w:t>
             </w:r>
           </w:p>
         </w:tc>
@@ -7099,7 +7219,7 @@
               <w:rPr>
                 <w:sz w:val="22"/>
               </w:rPr>
-              <w:t>79.31%</w:t>
+              <w:t>73.81%</w:t>
             </w:r>
           </w:p>
         </w:tc>
@@ -7140,7 +7260,7 @@
               <w:rPr>
                 <w:sz w:val="22"/>
               </w:rPr>
-              <w:t>64.29%</w:t>
+              <w:t>58.54%</w:t>
             </w:r>
           </w:p>
         </w:tc>
@@ -7168,7 +7288,7 @@
           <w:b w:val="0"/>
           <w:i w:val="0"/>
         </w:rPr>
-        <w:t>Trên câu hỏi thật: end-to-end Top-1 = 55.17% so với no-filter 44.83%, Top-3 = 75.86% so với 79.31%. Ở Top-3, lọc theo lớp lại kém hơn tìm trên toàn bộ vì khi bộ phân loại đoán sai lớp, Điều đúng bị loại hẳn khỏi danh sách. Lợi ích của bước phân loại vì vậy chỉ rõ ở Top-1.</w:t>
+        <w:t>Trên câu hỏi thật: end-to-end Top-1 = 50.00% so với no-filter 42.86%, Top-3 = 71.43% so với 73.81%. Ở Top-3, lọc theo lớp lại kém hơn tìm trên toàn bộ vì khi bộ phân loại đoán sai lớp, Điều đúng bị loại hẳn khỏi danh sách. Lợi ích của bước phân loại vì vậy chỉ rõ ở Top-1.</w:t>
       </w:r>
     </w:p>
     <w:p>
@@ -7204,7 +7324,7 @@
           <w:b w:val="0"/>
           <w:i w:val="0"/>
         </w:rPr>
-        <w:t>Thu thập được 116 câu hỏi thật: 29 câu trong phạm vi, 81 câu ngoài phạm vi, 6 câu hỏi nhiều ý (loại khỏi mọi phép đo). Câu ngoài phạm vi phần lớn thuộc văn bản khác (Luật Bảo hiểm xã hội, Bộ luật Lao động, Nghị định/Thông tư), trong đó 16 câu hoàn toàn khác chủ đề (miễn giảm học phí, tuyển sinh). Thí nghiệm offline (chưa tích hợp vào demo): dùng xác suất lớn nhất của Logistic Regression làm độ tin cậy, ngưỡng chọn tại phân vị 5% trên validation (0.232). Tỷ lệ bị từ chối: câu ngoài phạm vi 18.52%, câu thật trong phạm vi 6.90%, test synthetic 4.78%.</w:t>
+        <w:t>Thu thập được 176 câu hỏi thật: 42 câu trong phạm vi, 127 câu ngoài phạm vi, 7 câu hỏi nhiều ý (loại khỏi mọi phép đo). Câu ngoài phạm vi phần lớn thuộc văn bản khác (Luật Bảo hiểm xã hội, Bộ luật Lao động, Nghị định/Thông tư), trong đó 18 câu hoàn toàn khác chủ đề (miễn giảm học phí, tuyển sinh). Thí nghiệm offline (chưa tích hợp vào demo): dùng xác suất lớn nhất của Logistic Regression làm độ tin cậy, ngưỡng chọn tại phân vị 5% trên validation (0.232). Tỷ lệ bị từ chối: câu ngoài phạm vi 16.54%, câu thật trong phạm vi 7.14%, test synthetic 4.78%.</w:t>
       </w:r>
     </w:p>
     <w:p>
@@ -7304,7 +7424,7 @@
           <w:b w:val="0"/>
           <w:i w:val="0"/>
         </w:rPr>
-        <w:t>Hạn chế: dữ liệu huấn luyện do mô hình ngôn ngữ lớn sinh nên văn phong đồng đều hơn thực tế và có thể mang thiên lệch của mô hình sinh; nhãn câu hỏi thật do mô hình gán, người chỉ review các dòng không chắc chắn; tập câu hỏi thật nhỏ; chưa xử lý câu hỏi nhiều ý và câu ngoài phạm vi (Điều 63–93); chưa tích hợp mức xử phạt hành chính.</w:t>
+        <w:t>Hạn chế: dữ liệu huấn luyện do mô hình ngôn ngữ lớn sinh nên văn phong đồng đều hơn thực tế và có thể mang thiên lệch của mô hình sinh; nhãn câu hỏi thật do mô hình gán, chưa có người gán nhãn độc lập; tập câu hỏi thật nhỏ và lệch lớp; chưa xử lý câu hỏi nhiều ý và câu ngoài phạm vi (Điều 63–93); chưa tích hợp mức xử phạt hành chính.</w:t>
       </w:r>
     </w:p>
     <w:p>

</xml_diff>

<commit_message>
docs: report single-annotator agreement, fill cover and synthetic review
Report text now matches what was actually done (1 human blind annotator vs GPT); slide 1 metrics come from results.json.
</commit_message>
<xml_diff>
--- a/reports/BaoCao_DoAn_MayHoc.docx
+++ b/reports/BaoCao_DoAn_MayHoc.docx
@@ -104,7 +104,7 @@
           <w:b w:val="0"/>
           <w:sz w:val="26"/>
         </w:rPr>
-        <w:t>Giảng viên hướng dẫn: Thầy Cáp Phạm Đình Thăng</w:t>
+        <w:t>Môn học: CS114.F31.CN2.TTNT – Máy học</w:t>
       </w:r>
     </w:p>
     <w:p>
@@ -116,7 +116,7 @@
           <w:b w:val="0"/>
           <w:sz w:val="26"/>
         </w:rPr>
-        <w:t>Nhóm thực hiện: &lt;Họ tên – MSSV&gt;</w:t>
+        <w:t>Giảng viên hướng dẫn: ThS. Cáp Phạm Đình Thăng</w:t>
       </w:r>
     </w:p>
     <w:p>
@@ -128,7 +128,7 @@
           <w:b w:val="0"/>
           <w:sz w:val="26"/>
         </w:rPr>
-        <w:t>&lt;Họ tên – MSSV&gt;</w:t>
+        <w:t>Nhóm thực hiện: Nhóm 27</w:t>
       </w:r>
     </w:p>
     <w:p>
@@ -140,7 +140,31 @@
           <w:b w:val="0"/>
           <w:sz w:val="26"/>
         </w:rPr>
-        <w:t>&lt;Họ tên – MSSV&gt;</w:t>
+        <w:t>Đỗ Quốc Hoàng – 26410043</w:t>
+      </w:r>
+    </w:p>
+    <w:p>
+      <w:pPr>
+        <w:jc w:val="center"/>
+      </w:pPr>
+      <w:r>
+        <w:rPr>
+          <w:b w:val="0"/>
+          <w:sz w:val="26"/>
+        </w:rPr>
+        <w:t>Nguyễn Trí Toàn – 26410135</w:t>
+      </w:r>
+    </w:p>
+    <w:p>
+      <w:pPr>
+        <w:jc w:val="center"/>
+      </w:pPr>
+      <w:r>
+        <w:rPr>
+          <w:b w:val="0"/>
+          <w:sz w:val="26"/>
+        </w:rPr>
+        <w:t>Nguyễn Văn Thái – 26410108</w:t>
       </w:r>
     </w:p>
     <w:p>
@@ -1444,7 +1468,7 @@
           <w:b w:val="0"/>
           <w:i w:val="0"/>
         </w:rPr>
-        <w:t>Nguồn gốc dữ liệu và nhãn (công khai): toàn bộ câu hỏi synthetic do mô hình ngôn ngữ lớn (Claude) sinh, theo hướng dẫn gán nhãn của nhóm (docs/labeling-guidelines.md): với mỗi Điều, mô hình viết câu hỏi gốc có căn cứ trong Điều đó rồi viết 4 biến thể văn phong. Nhãn lớp không do mô hình chọn mà suy ra tự động từ Điều. Dữ liệu được kiểm bằng script tự động (scripts/validate_generated.py): đủ 40 câu gốc mỗi lớp, mỗi câu gốc đủ 5 văn phong cùng một Điều, Điều thuộc đúng lớp, mọi Điều của lớp đều có câu hỏi, không có câu trùng, độ dài 2–60 từ. Các câu dễ nhầm lớp được ghi lý do chọn Điều trong data/raw/gen/hard_c*.md. Chưa đo độ đồng thuận giữa người gán nhãn. [NHÓM ĐIỀN SAU KHI REVIEW, xem docs/team-todo.md: nhóm đã đọc kiểm tra N câu gốc, phát hiện X câu sai, đã sửa/loại Y câu.]</w:t>
+        <w:t>Nguồn gốc dữ liệu và nhãn (công khai): toàn bộ câu hỏi synthetic do mô hình ngôn ngữ lớn (Claude) sinh, theo hướng dẫn gán nhãn của nhóm (docs/labeling-guidelines.md): với mỗi Điều, mô hình viết câu hỏi gốc có căn cứ trong Điều đó rồi viết 4 biến thể văn phong. Nhãn lớp không do mô hình chọn mà suy ra tự động từ Điều. Dữ liệu được kiểm bằng script tự động (scripts/validate_generated.py): đủ 40 câu gốc mỗi lớp, mỗi câu gốc đủ 5 văn phong cùng một Điều, Điều thuộc đúng lớp, mọi Điều của lớp đều có câu hỏi, không có câu trùng, độ dài 2–60 từ. Các câu dễ nhầm lớp được ghi lý do chọn Điều trong data/raw/gen/hard_c*.md. Nhóm đã đọc kiểm tra thủ công 40 câu gốc chọn ngẫu nhiên (5 câu mỗi lớp, docs/synthetic-sample-review.md), đối chiếu từng câu với Khoản của Điều được gán: không phát hiện câu nào sai. Mẫu này chỉ chiếm một phần nhỏ nên không loại trừ hết lỗi trong toàn bộ dữ liệu.</w:t>
       </w:r>
     </w:p>
     <w:p>
@@ -2074,9 +2098,9 @@
       <w:r>
         <w:rPr>
           <w:b w:val="0"/>
-          <w:i/>
+          <w:i w:val="0"/>
         </w:rPr>
-        <w:t>[NHÓM ĐIỀN SAU KHI GÁN NHÃN MÙ, xem docs/team-todo.md mục A: chạy `python -m scripts.blind_labeling score` rồi build lại báo cáo, đoạn này sẽ tự điền số đồng thuận.]</w:t>
+        <w:t>Kiểm chứng bằng người: thành viên A gán nhãn mù 176 câu hỏi thật (không xem nhãn của GPT, scripts/blind_labeling.py). So với nhãn GPT gốc: đồng thuận 98.30% theo lớp (8 lớp + ngoài phạm vi + nhiều ý), Cohen's kappa = 0.96; trên 41 câu cả hai cùng chọn trong phạm vi, trùng Điều 97.56%. 3 câu khác nhau được liệt kê để chốt nhãn cuối (docs/label-adjudication.md); số đồng thuận tính trên nhãn GPT gốc trước khi chốt. Phiếu B được điền với trợ giúp của một mô hình ngôn ngữ khác (Codex), không phải người, nên chỉ dùng tham khảo khi chốt nhãn (đồng thuận với A: 94.32%, kappa = 0.88) và không được tính là người gán nhãn độc lập. Hạn chế: chỉ có 1 người gán nhãn nên chưa đo được độ đồng thuận giữa người với người.</w:t>
       </w:r>
     </w:p>
     <w:p>
@@ -2956,7 +2980,7 @@
               <w:rPr>
                 <w:sz w:val="22"/>
               </w:rPr>
-              <w:t>1.8</w:t>
+              <w:t>1.7</w:t>
             </w:r>
           </w:p>
         </w:tc>
@@ -3064,7 +3088,7 @@
               <w:rPr>
                 <w:sz w:val="22"/>
               </w:rPr>
-              <w:t>0.4</w:t>
+              <w:t>0.5</w:t>
             </w:r>
           </w:p>
         </w:tc>
@@ -3118,7 +3142,7 @@
               <w:rPr>
                 <w:sz w:val="22"/>
               </w:rPr>
-              <w:t>3.3</w:t>
+              <w:t>3.2</w:t>
             </w:r>
           </w:p>
         </w:tc>
@@ -7424,7 +7448,7 @@
           <w:b w:val="0"/>
           <w:i w:val="0"/>
         </w:rPr>
-        <w:t>Hạn chế: dữ liệu huấn luyện do mô hình ngôn ngữ lớn sinh nên văn phong đồng đều hơn thực tế và có thể mang thiên lệch của mô hình sinh; nhãn câu hỏi thật do mô hình gán, chưa có người gán nhãn độc lập; tập câu hỏi thật nhỏ và lệch lớp; chưa xử lý câu hỏi nhiều ý và câu ngoài phạm vi (Điều 63–93); chưa tích hợp mức xử phạt hành chính.</w:t>
+        <w:t>Hạn chế: dữ liệu huấn luyện do mô hình ngôn ngữ lớn sinh nên văn phong đồng đều hơn thực tế và có thể mang thiên lệch của mô hình sinh; nhãn câu hỏi thật do mô hình gán rồi được 1 thành viên gán nhãn mù để kiểm chứng, chưa đo được đồng thuận giữa người với người; tập câu hỏi thật nhỏ và lệch lớp; chưa xử lý câu hỏi nhiều ý và câu ngoài phạm vi (Điều 63–93); chưa tích hợp mức xử phạt hành chính.</w:t>
       </w:r>
     </w:p>
     <w:p>
@@ -7444,7 +7468,7 @@
         <w:pStyle w:val="ListBullet"/>
       </w:pPr>
       <w:r>
-        <w:t>Thu thập và gán nhãn thêm câu hỏi thật, đo độ đồng thuận giữa người gán nhãn (Cohen's kappa).</w:t>
+        <w:t>Thu thập thêm câu hỏi thật cho các lớp đang thiếu (C0, C2, C4, C6); thêm ít nhất một người gán nhãn mù để đo Cohen's kappa giữa người với người.</w:t>
       </w:r>
     </w:p>
     <w:p>

</xml_diff>

<commit_message>
fix(figures): right-align rotated confusion-matrix tick labels
Center-aligned 45° labels sat left of their columns, making the matrix look misaligned on slides.
</commit_message>
<xml_diff>
--- a/reports/BaoCao_DoAn_MayHoc.docx
+++ b/reports/BaoCao_DoAn_MayHoc.docx
@@ -2980,7 +2980,7 @@
               <w:rPr>
                 <w:sz w:val="22"/>
               </w:rPr>
-              <w:t>1.7</w:t>
+              <w:t>1.8</w:t>
             </w:r>
           </w:p>
         </w:tc>
@@ -3088,7 +3088,7 @@
               <w:rPr>
                 <w:sz w:val="22"/>
               </w:rPr>
-              <w:t>0.5</w:t>
+              <w:t>0.4</w:t>
             </w:r>
           </w:p>
         </w:tc>
@@ -3142,7 +3142,7 @@
               <w:rPr>
                 <w:sz w:val="22"/>
               </w:rPr>
-              <w:t>3.2</w:t>
+              <w:t>3.4</w:t>
             </w:r>
           </w:p>
         </w:tc>
@@ -4554,7 +4554,7 @@
       <w:r>
         <w:drawing>
           <wp:inline xmlns:a="http://schemas.openxmlformats.org/drawingml/2006/main" xmlns:pic="http://schemas.openxmlformats.org/drawingml/2006/picture">
-            <wp:extent cx="5760000" cy="2086244"/>
+            <wp:extent cx="5760000" cy="2087517"/>
             <wp:docPr id="5" name="Picture 5"/>
             <wp:cNvGraphicFramePr>
               <a:graphicFrameLocks noChangeAspect="1"/>
@@ -4575,7 +4575,7 @@
                   <pic:spPr>
                     <a:xfrm>
                       <a:off x="0" y="0"/>
-                      <a:ext cx="5760000" cy="2086244"/>
+                      <a:ext cx="5760000" cy="2087517"/>
                     </a:xfrm>
                     <a:prstGeom prst="rect"/>
                   </pic:spPr>

</xml_diff>

<commit_message>
docs: add demo screenshot to report 7.4 and a demo slide
Replaces the last report placeholder; both builders pick up reports/figures/demo.png so rebuilds keep the image.
</commit_message>
<xml_diff>
--- a/reports/BaoCao_DoAn_MayHoc.docx
+++ b/reports/BaoCao_DoAn_MayHoc.docx
@@ -7322,9 +7322,61 @@
       <w:r>
         <w:rPr>
           <w:b w:val="0"/>
+          <w:i w:val="0"/>
+        </w:rPr>
+        <w:t>Giao diện demo (Streamlit, app.py): người dùng nhập câu hỏi, hệ thống hiển thị nhóm quy định dự đoán, điểm tin cậy tương đối (softmax trên điểm quyết định của Linear SVM (LinearSVC), cảnh báo khi dưới 0.4, không từ chối trả lời) và toàn văn các Điều luật liên quan nhất.</w:t>
+      </w:r>
+    </w:p>
+    <w:p>
+      <w:pPr>
+        <w:jc w:val="center"/>
+      </w:pPr>
+      <w:r>
+        <w:drawing>
+          <wp:inline xmlns:a="http://schemas.openxmlformats.org/drawingml/2006/main" xmlns:pic="http://schemas.openxmlformats.org/drawingml/2006/picture">
+            <wp:extent cx="5760000" cy="3102603"/>
+            <wp:docPr id="9" name="Picture 9"/>
+            <wp:cNvGraphicFramePr>
+              <a:graphicFrameLocks noChangeAspect="1"/>
+            </wp:cNvGraphicFramePr>
+            <a:graphic>
+              <a:graphicData uri="http://schemas.openxmlformats.org/drawingml/2006/picture">
+                <pic:pic>
+                  <pic:nvPicPr>
+                    <pic:cNvPr id="0" name="demo.png"/>
+                    <pic:cNvPicPr/>
+                  </pic:nvPicPr>
+                  <pic:blipFill>
+                    <a:blip r:embed="rId17"/>
+                    <a:stretch>
+                      <a:fillRect/>
+                    </a:stretch>
+                  </pic:blipFill>
+                  <pic:spPr>
+                    <a:xfrm>
+                      <a:off x="0" y="0"/>
+                      <a:ext cx="5760000" cy="3102603"/>
+                    </a:xfrm>
+                    <a:prstGeom prst="rect"/>
+                  </pic:spPr>
+                </pic:pic>
+              </a:graphicData>
+            </a:graphic>
+          </wp:inline>
+        </w:drawing>
+      </w:r>
+    </w:p>
+    <w:p>
+      <w:pPr>
+        <w:spacing w:after="120" w:line="312" w:lineRule="auto"/>
+        <w:jc w:val="center"/>
+      </w:pPr>
+      <w:r>
+        <w:rPr>
+          <w:b w:val="0"/>
           <w:i/>
         </w:rPr>
-        <w:t>Giao diện demo (Streamlit, app.py): người dùng nhập câu hỏi, hệ thống hiển thị nhóm quy định dự đoán, điểm tin cậy tương đối (softmax trên điểm quyết định của Linear SVM (LinearSVC), cảnh báo khi dưới 0.4, không từ chối trả lời) và toàn văn các Điều luật liên quan nhất. [Chèn ảnh chụp màn hình demo]</w:t>
+        <w:t>Hình 9. Giao diện demo tra cứu (Streamlit)</w:t>
       </w:r>
     </w:p>
     <w:p>
@@ -7371,7 +7423,7 @@
         <w:drawing>
           <wp:inline xmlns:a="http://schemas.openxmlformats.org/drawingml/2006/main" xmlns:pic="http://schemas.openxmlformats.org/drawingml/2006/picture">
             <wp:extent cx="4680000" cy="2014177"/>
-            <wp:docPr id="9" name="Picture 9"/>
+            <wp:docPr id="10" name="Picture 10"/>
             <wp:cNvGraphicFramePr>
               <a:graphicFrameLocks noChangeAspect="1"/>
             </wp:cNvGraphicFramePr>
@@ -7383,7 +7435,7 @@
                     <pic:cNvPicPr/>
                   </pic:nvPicPr>
                   <pic:blipFill>
-                    <a:blip r:embed="rId17"/>
+                    <a:blip r:embed="rId18"/>
                     <a:stretch>
                       <a:fillRect/>
                     </a:stretch>
@@ -7412,7 +7464,7 @@
           <w:b w:val="0"/>
           <w:i/>
         </w:rPr>
-        <w:t>Hình 9. Phân bố độ tin cậy: trong phạm vi và ngoài phạm vi</w:t>
+        <w:t>Hình 10. Phân bố độ tin cậy: trong phạm vi và ngoài phạm vi</w:t>
       </w:r>
     </w:p>
     <w:p>

</xml_diff>